<commit_message>
ARAI spec as Type1-DLX, along with IPO filing pack
</commit_message>
<xml_diff>
--- a/docs/Road-Wagon Bus Specification.docx
+++ b/docs/Road-Wagon Bus Specification.docx
@@ -204,12 +204,13 @@
             </w:tcBorders>
           </w:tcPr>
           <w:p>
-            <w:r/>
-            <w:r>
-              <w:rPr>
-                <w:sz w:val="21"/>
-              </w:rPr>
-              <w:t>ARAI Type-I SDX, Standard Bus (Medium Capacity)</w:t>
+            <w:r>
+              <w:t>ARAI Type-I DLX, Standard Bus (Medium Capacity)</w:t>
+            </w:r>
+            <w:r>
+              <w:rPr>
+                <w:sz w:val="21"/>
+              </w:rPr>
             </w:r>
           </w:p>
         </w:tc>
@@ -433,7 +434,7 @@
           <w:i w:val="0"/>
           <w:sz w:val="22"/>
         </w:rPr>
-        <w:t>The specification is drafted for type approval under AIS-052 (Revision 1) — the ARAI Code of Practice for Bus Body Design and Approval — as a Type-I SDX (semi-deluxe) Standard Bus in the Medium Capacity category, and is intended to support body-builder, fleet operator, and regulatory review.</w:t>
+        <w:t>The specification is drafted for type approval under AIS-052 (Revision 1) — the ARAI Code of Practice for Bus Body Design and Approval — as a Type-I DLX (deluxe) Standard Bus in the Medium Capacity category, and is intended to support body-builder, fleet operator, and regulatory review.</w:t>
       </w:r>
     </w:p>
     <w:tbl>
@@ -1556,12 +1557,13 @@
             <w:pPr>
               <w:spacing w:after="0"/>
             </w:pPr>
-            <w:r/>
-            <w:r>
-              <w:rPr>
-                <w:sz w:val="21"/>
-              </w:rPr>
-              <w:t>1.1.10 / 2.2.11.2</w:t>
+            <w:r>
+              <w:t>1.1.10 / 2.2.1.1.6.1 / 2.2.11.2</w:t>
+            </w:r>
+            <w:r>
+              <w:rPr>
+                <w:sz w:val="21"/>
+              </w:rPr>
             </w:r>
           </w:p>
         </w:tc>
@@ -4798,12 +4800,13 @@
             <w:pPr>
               <w:spacing w:after="0"/>
             </w:pPr>
-            <w:r/>
-            <w:r>
-              <w:rPr>
-                <w:sz w:val="21"/>
-              </w:rPr>
-              <w:t>Service — stepped</w:t>
+            <w:r>
+              <w:t>Service door (req'd min)</w:t>
+            </w:r>
+            <w:r>
+              <w:rPr>
+                <w:sz w:val="21"/>
+              </w:rPr>
             </w:r>
           </w:p>
         </w:tc>
@@ -4968,12 +4971,13 @@
             <w:pPr>
               <w:spacing w:after="0"/>
             </w:pPr>
-            <w:r/>
-            <w:r>
-              <w:rPr>
-                <w:sz w:val="21"/>
-              </w:rPr>
-              <w:t>Service — platform</w:t>
+            <w:r>
+              <w:t>Additional service door (platform)</w:t>
+            </w:r>
+            <w:r>
+              <w:rPr>
+                <w:sz w:val="21"/>
+              </w:rPr>
             </w:r>
           </w:p>
         </w:tc>
@@ -5138,12 +5142,13 @@
             <w:pPr>
               <w:spacing w:after="0"/>
             </w:pPr>
-            <w:r/>
-            <w:r>
-              <w:rPr>
-                <w:sz w:val="21"/>
-              </w:rPr>
-              <w:t>Service — platform</w:t>
+            <w:r>
+              <w:t>Additional service door (platform)</w:t>
+            </w:r>
+            <w:r>
+              <w:rPr>
+                <w:sz w:val="21"/>
+              </w:rPr>
             </w:r>
           </w:p>
         </w:tc>
@@ -5308,12 +5313,13 @@
             <w:pPr>
               <w:spacing w:after="0"/>
             </w:pPr>
-            <w:r/>
-            <w:r>
-              <w:rPr>
-                <w:sz w:val="21"/>
-              </w:rPr>
-              <w:t>Service — platform</w:t>
+            <w:r>
+              <w:t>Additional service door (platform)</w:t>
+            </w:r>
+            <w:r>
+              <w:rPr>
+                <w:sz w:val="21"/>
+              </w:rPr>
             </w:r>
           </w:p>
         </w:tc>
@@ -5478,12 +5484,13 @@
             <w:pPr>
               <w:spacing w:after="0"/>
             </w:pPr>
-            <w:r/>
-            <w:r>
-              <w:rPr>
-                <w:sz w:val="21"/>
-              </w:rPr>
-              <w:t>Service — platform</w:t>
+            <w:r>
+              <w:t>Additional service door (platform)</w:t>
+            </w:r>
+            <w:r>
+              <w:rPr>
+                <w:sz w:val="21"/>
+              </w:rPr>
             </w:r>
           </w:p>
         </w:tc>
@@ -5648,12 +5655,13 @@
             <w:pPr>
               <w:spacing w:after="0"/>
             </w:pPr>
-            <w:r/>
-            <w:r>
-              <w:rPr>
-                <w:sz w:val="21"/>
-              </w:rPr>
-              <w:t>Service — platform</w:t>
+            <w:r>
+              <w:t>Additional service door (platform)</w:t>
+            </w:r>
+            <w:r>
+              <w:rPr>
+                <w:sz w:val="21"/>
+              </w:rPr>
             </w:r>
           </w:p>
         </w:tc>
@@ -5818,12 +5826,13 @@
             <w:pPr>
               <w:spacing w:after="0"/>
             </w:pPr>
-            <w:r/>
-            <w:r>
-              <w:rPr>
-                <w:sz w:val="21"/>
-              </w:rPr>
-              <w:t>Service — platform</w:t>
+            <w:r>
+              <w:t>Additional service door (platform)</w:t>
+            </w:r>
+            <w:r>
+              <w:rPr>
+                <w:sz w:val="21"/>
+              </w:rPr>
             </w:r>
           </w:p>
         </w:tc>
@@ -5931,13 +5940,14 @@
             <w:pPr>
               <w:spacing w:after="40"/>
             </w:pPr>
-            <w:r/>
+            <w:r>
+              <w:t>Classification rationale (AIS-052 cl. 2.2.1.1.6.1): Type-I DLX requires a minimum of one (1) service door. D1, on the nearside, satisfies both the minimum count (cl. 2.2.1.1.6.1) and the nearside-disposition rule (cl. 2.2.1.1.1). Doors D2-D7 are additional service doors, geofenced and platform-presence-interlocked to open only at approved Road-Wagon boarding interfaces. Per cl. 2.2.1.1.6.3, a second service exit is OPTIONAL for Type-I DLX — we provide six. All seven doors are also fitted with mechanical emergency release per cl. 3.4.5.1.</w:t>
+            </w:r>
             <w:r>
               <w:rPr>
                 <w:i/>
                 <w:sz w:val="21"/>
               </w:rPr>
-              <w:t>D1 (stepped, nearside) satisfies AIS-052 2.2.1.1.1 (service door on side nearer to traffic direction). D2-D7 are additional service doors that operate only when the vehicle is docked at an approved Road-Wagon platform. All seven doors are electrically interlocked with vehicle motion and door-edge proximity sensors.</w:t>
             </w:r>
           </w:p>
         </w:tc>
@@ -7510,7 +7520,7 @@
           <w:i w:val="0"/>
           <w:sz w:val="22"/>
         </w:rPr>
-        <w:t>AIS-052 requires at least one emergency exit (door type) opposite the service door for Type-II/III. For a Type-I bus with seven service doors distributed bilaterally, fulfilment is achieved via:</w:t>
+        <w:t>Emergency egress relies on three dedicated emergency exits (E1, E2, E3) plus the mechanical-release capability built into every one of the seven service doors. Service-door release is independent of the platform-presence interlock so as to function in any orientation, in line with cl. 3.4.5.1:</w:t>
       </w:r>
     </w:p>
     <w:p>
@@ -7590,13 +7600,14 @@
             <w:pPr>
               <w:spacing w:after="40"/>
             </w:pPr>
-            <w:r/>
+            <w:r>
+              <w:t>Under Type-I DLX (cl. 2.2.4.1), an emergency-exit door is not mandated on the side opposite the service door (that rule is specific to Type-II/Type-III). The combination of three dedicated emergency exits (E1 rear-left window, E2 rear-right window, E3 roof hatch) plus seven service doors with mechanical release substantially exceeds the cl. 2.2.3 emergency-exit number-and-area requirement for a 92-passenger bus.</w:t>
+            </w:r>
             <w:r>
               <w:rPr>
                 <w:i/>
                 <w:sz w:val="21"/>
               </w:rPr>
-              <w:t>AIS-052 clause 2.2.4 emergency-door geometry rules do not apply when emergency egress capacity is provided through service doors with mechanical override; however, exit area redundancy is preserved through E1/E2/E3 to comply with 2.2.3 (number/area of emergency exits).</w:t>
             </w:r>
           </w:p>
         </w:tc>
@@ -10065,12 +10076,13 @@
             <w:pPr>
               <w:spacing w:after="0"/>
             </w:pPr>
-            <w:r/>
-            <w:r>
-              <w:rPr>
-                <w:sz w:val="21"/>
-              </w:rPr>
-              <w:t>32 °C / 60 % RH internal at 45 °C ambient (Type-I SDX = non-AC permissible; AC variant provided)</w:t>
+            <w:r>
+              <w:t>32 °C / 60 % RH internal at 45 °C ambient (Type-I DLX = AC permissible (DLX subtype); AC variant provided)</w:t>
+            </w:r>
+            <w:r>
+              <w:rPr>
+                <w:sz w:val="21"/>
+              </w:rPr>
             </w:r>
           </w:p>
         </w:tc>
@@ -10771,7 +10783,7 @@
         <w:rPr>
           <w:sz w:val="22"/>
         </w:rPr>
-        <w:t>Toilet: not provided (Type-I SDX, urban service).</w:t>
+        <w:t>Toilet: not provided (Type-I DLX, urban service).</w:t>
       </w:r>
     </w:p>
     <w:p>
@@ -12264,12 +12276,13 @@
             <w:pPr>
               <w:spacing w:after="0"/>
             </w:pPr>
-            <w:r/>
-            <w:r>
-              <w:rPr>
-                <w:sz w:val="21"/>
-              </w:rPr>
-              <w:t>1.1.10 / 2.2.11.2</w:t>
+            <w:r>
+              <w:t>1.1.10 / 2.2.1.1.6.1 / 2.2.11.2</w:t>
+            </w:r>
+            <w:r>
+              <w:rPr>
+                <w:sz w:val="21"/>
+              </w:rPr>
             </w:r>
           </w:p>
         </w:tc>
@@ -12312,12 +12325,13 @@
             <w:pPr>
               <w:spacing w:after="0"/>
             </w:pPr>
-            <w:r/>
-            <w:r>
-              <w:rPr>
-                <w:sz w:val="21"/>
-              </w:rPr>
-              <w:t>Type-I SDX, Medium Capacity Standard</w:t>
+            <w:r>
+              <w:t>Type-I DLX, Medium Capacity Standard</w:t>
+            </w:r>
+            <w:r>
+              <w:rPr>
+                <w:sz w:val="21"/>
+              </w:rPr>
             </w:r>
           </w:p>
         </w:tc>
@@ -12386,12 +12400,13 @@
             <w:pPr>
               <w:spacing w:after="0"/>
             </w:pPr>
-            <w:r/>
-            <w:r>
-              <w:rPr>
-                <w:sz w:val="21"/>
-              </w:rPr>
-              <w:t>Service door on nearside</w:t>
+            <w:r>
+              <w:t>Service door on nearside (min 1 for Type-I DLX)</w:t>
+            </w:r>
+            <w:r>
+              <w:rPr>
+                <w:sz w:val="21"/>
+              </w:rPr>
             </w:r>
           </w:p>
         </w:tc>
@@ -12484,12 +12499,13 @@
             <w:pPr>
               <w:spacing w:after="0"/>
             </w:pPr>
-            <w:r/>
-            <w:r>
-              <w:rPr>
-                <w:sz w:val="21"/>
-              </w:rPr>
-              <w:t>Service-door min. width 650 mm</w:t>
+            <w:r>
+              <w:t>Service-door min. width 650 mm (cl. 2.2.1.1.2)</w:t>
+            </w:r>
+            <w:r>
+              <w:rPr>
+                <w:sz w:val="21"/>
+              </w:rPr>
             </w:r>
           </w:p>
         </w:tc>
@@ -14008,6 +14024,64 @@
                 <w:sz w:val="21"/>
               </w:rPr>
               <w:t>Cl. 6.4 / 7</w:t>
+            </w:r>
+          </w:p>
+        </w:tc>
+      </w:tr>
+      <w:tr>
+        <w:tc>
+          <w:tcPr>
+            <w:tcW w:type="dxa" w:w="1984"/>
+          </w:tcPr>
+          <w:p>
+            <w:r/>
+            <w:r>
+              <w:rPr>
+                <w:sz w:val="21"/>
+              </w:rPr>
+              <w:t>2.2.1.1.6.1 / 2.2.1.1.6.3</w:t>
+            </w:r>
+          </w:p>
+        </w:tc>
+        <w:tc>
+          <w:tcPr>
+            <w:tcW w:type="dxa" w:w="2268"/>
+          </w:tcPr>
+          <w:p>
+            <w:r/>
+            <w:r>
+              <w:rPr>
+                <w:sz w:val="21"/>
+              </w:rPr>
+              <w:t>Min. service doors (Type-I DLX = 1; 2nd exit optional)</w:t>
+            </w:r>
+          </w:p>
+        </w:tc>
+        <w:tc>
+          <w:tcPr>
+            <w:tcW w:type="dxa" w:w="3402"/>
+          </w:tcPr>
+          <w:p>
+            <w:r/>
+            <w:r>
+              <w:rPr>
+                <w:sz w:val="21"/>
+              </w:rPr>
+              <w:t>1 stepped + 6 platform-level = 7 service doors total</w:t>
+            </w:r>
+          </w:p>
+        </w:tc>
+        <w:tc>
+          <w:tcPr>
+            <w:tcW w:type="dxa" w:w="1417"/>
+          </w:tcPr>
+          <w:p>
+            <w:r/>
+            <w:r>
+              <w:rPr>
+                <w:sz w:val="21"/>
+              </w:rPr>
+              <w:t>Cl. 6.2 / 6.4</w:t>
             </w:r>
           </w:p>
         </w:tc>

</xml_diff>